<commit_message>
Updated Changes to v2.0
</commit_message>
<xml_diff>
--- a/docs/GalSync-Design.docx
+++ b/docs/GalSync-Design.docx
@@ -9512,10 +9512,10 @@
           <w:sz w:val="19"/>
           <w:szCs w:val="19"/>
         </w:rPr>
-        <w:t>infra/main.bicep</w:t>
-      </w:r>
-      <w:r>
-        <w:t xml:space="preserve"> into the Azure Government subscription. Deploy </w:t>
+        <w:t xml:space="preserve">infra/main.bicep</w:t>
+      </w:r>
+      <w:r>
+        <w:t xml:space="preserve"> into the Azure Government subscription with </w:t>
       </w:r>
       <w:r>
         <w:rPr>
@@ -9523,10 +9523,76 @@
           <w:sz w:val="19"/>
           <w:szCs w:val="19"/>
         </w:rPr>
-        <w:t>infra/network.bicep</w:t>
-      </w:r>
-      <w:r>
-        <w:t xml:space="preserve"> if the runbook will egress through the hub firewall. Confirm the Automation managed identity's Key Vault and storage role assignments.</w:t>
+        <w:t xml:space="preserve">enableSchedule = false</w:t>
+      </w:r>
+      <w:r>
+        <w:t xml:space="preserve"> (the default). This creates the Automation account, runbook and module imports but no schedule, so nothing can run unattended before the pilot is signed off. Deploy </w:t>
+      </w:r>
+      <w:r>
+        <w:rPr>
+          <w:rFonts w:ascii="Consolas" w:eastAsia="Consolas" w:hAnsi="Consolas" w:cs="Consolas"/>
+          <w:sz w:val="19"/>
+          <w:szCs w:val="19"/>
+        </w:rPr>
+        <w:t xml:space="preserve">infra/network.bicep</w:t>
+      </w:r>
+      <w:r>
+        <w:t xml:space="preserve"> if the runbook will egress through the hub firewall. Confirm the Automation managed identity's Key Vault and storage role assignments, and copy the </w:t>
+      </w:r>
+      <w:r>
+        <w:rPr>
+          <w:rFonts w:ascii="Consolas" w:eastAsia="Consolas" w:hAnsi="Consolas" w:cs="Consolas"/>
+          <w:sz w:val="19"/>
+          <w:szCs w:val="19"/>
+        </w:rPr>
+        <w:t xml:space="preserve">keyVaultName</w:t>
+      </w:r>
+      <w:r>
+        <w:t xml:space="preserve">, </w:t>
+      </w:r>
+      <w:r>
+        <w:rPr>
+          <w:rFonts w:ascii="Consolas" w:eastAsia="Consolas" w:hAnsi="Consolas" w:cs="Consolas"/>
+          <w:sz w:val="19"/>
+          <w:szCs w:val="19"/>
+        </w:rPr>
+        <w:t xml:space="preserve">storageAccountName</w:t>
+      </w:r>
+      <w:r>
+        <w:t xml:space="preserve"> and </w:t>
+      </w:r>
+      <w:r>
+        <w:rPr>
+          <w:rFonts w:ascii="Consolas" w:eastAsia="Consolas" w:hAnsi="Consolas" w:cs="Consolas"/>
+          <w:sz w:val="19"/>
+          <w:szCs w:val="19"/>
+        </w:rPr>
+        <w:t xml:space="preserve">workspaceResourceId</w:t>
+      </w:r>
+      <w:r>
+        <w:t xml:space="preserve"> deployment outputs into the </w:t>
+      </w:r>
+      <w:r>
+        <w:rPr>
+          <w:rFonts w:ascii="Consolas" w:eastAsia="Consolas" w:hAnsi="Consolas" w:cs="Consolas"/>
+          <w:sz w:val="19"/>
+          <w:szCs w:val="19"/>
+        </w:rPr>
+        <w:t xml:space="preserve">runtime</w:t>
+      </w:r>
+      <w:r>
+        <w:t xml:space="preserve"> block of </w:t>
+      </w:r>
+      <w:r>
+        <w:rPr>
+          <w:rFonts w:ascii="Consolas" w:eastAsia="Consolas" w:hAnsi="Consolas" w:cs="Consolas"/>
+          <w:sz w:val="19"/>
+          <w:szCs w:val="19"/>
+        </w:rPr>
+        <w:t xml:space="preserve">config/galsync.config.json</w:t>
+      </w:r>
+      <w:r>
+        <w:t xml:space="preserve">.</w:t>
       </w:r>
     </w:p>
     <w:p>
@@ -9685,7 +9751,51 @@
         <w:t>Phase 6 — Production (1 week).</w:t>
       </w:r>
       <w:r>
-        <w:t xml:space="preserve"> Expand the include groups to the full agreed population — watch the create ceiling and raise it deliberately for the first bulk run, then lower it again. Enable the hourly schedule. Enable the alert rules. Hand over using </w:t>
+        <w:t xml:space="preserve"> Expand the include groups to the full agreed population — watch the create ceiling and raise it deliberately for the first bulk run, then lower it again. Enable the hourly schedule by redeploying </w:t>
+      </w:r>
+      <w:r>
+        <w:rPr>
+          <w:rFonts w:ascii="Consolas" w:eastAsia="Consolas" w:hAnsi="Consolas" w:cs="Consolas"/>
+          <w:sz w:val="19"/>
+          <w:szCs w:val="19"/>
+        </w:rPr>
+        <w:t xml:space="preserve">infra/main.bicep</w:t>
+      </w:r>
+      <w:r>
+        <w:t xml:space="preserve"> with </w:t>
+      </w:r>
+      <w:r>
+        <w:rPr>
+          <w:rFonts w:ascii="Consolas" w:eastAsia="Consolas" w:hAnsi="Consolas" w:cs="Consolas"/>
+          <w:sz w:val="19"/>
+          <w:szCs w:val="19"/>
+        </w:rPr>
+        <w:t xml:space="preserve">enableSchedule = true</w:t>
+      </w:r>
+      <w:r>
+        <w:t xml:space="preserve">; </w:t>
+      </w:r>
+      <w:r>
+        <w:rPr>
+          <w:rFonts w:ascii="Consolas" w:eastAsia="Consolas" w:hAnsi="Consolas" w:cs="Consolas"/>
+          <w:sz w:val="19"/>
+          <w:szCs w:val="19"/>
+        </w:rPr>
+        <w:t xml:space="preserve">scheduleStartTime</w:t>
+      </w:r>
+      <w:r>
+        <w:t xml:space="preserve"> defaults to one hour after the deployment, or set a future UTC time in </w:t>
+      </w:r>
+      <w:r>
+        <w:rPr>
+          <w:rFonts w:ascii="Consolas" w:eastAsia="Consolas" w:hAnsi="Consolas" w:cs="Consolas"/>
+          <w:sz w:val="19"/>
+          <w:szCs w:val="19"/>
+        </w:rPr>
+        <w:t xml:space="preserve">main.bicepparam</w:t>
+      </w:r>
+      <w:r>
+        <w:t xml:space="preserve">. Enable the alert rules. Hand over using </w:t>
       </w:r>
       <w:r>
         <w:rPr>

</xml_diff>